<commit_message>
Take the styling direction back out of the script
The Essentials screenshot was shared to check objective alignment across the
series, including the lessons still to come in HMIS Basic Navigation. I read it as
a visual reference and wrote layout into the objectives slide — numbering down the
right, a solid colour panel. That is not this pass.

Removed, and the front matter now says so: production notes describe what a screen
has to do and what the learner does on it, not how it looks. Styling goes with
sources and external links in a later pass.

The objectives rationale now says the other half of the point as well — they are
written to leave room for objectives 03 to 05, so this lesson does not spend what
the later lessons need.

Co-Authored-By: Claude Opus 5 <noreply@anthropic.com>
Claude-Session: https://claude.ai/code/session_01UBHiohJpkHfRFJTFRdMz31
</commit_message>
<xml_diff>
--- a/HMIS BNTS - Search/Script - HMIS BNTS Lesson 1 - Finding a Participant.docx
+++ b/HMIS BNTS - Search/Script - HMIS BNTS Lesson 1 - Finding a Participant.docx
@@ -473,7 +473,7 @@
           <w:i/>
           <w:u w:val="none"/>
         </w:rPr>
-        <w:t>Not yet in this draft, and deliberately: external links and source citations, which are a separate pass once the content is agreed.</w:t>
+        <w:t>Not yet in this draft, and deliberately: external links and source citations, and any visual or layout direction. Production notes describe what a screen has to do and what the learner does on it, not how it should look. Styling is a later pass, once the content is agreed.</w:t>
       </w:r>
     </w:p>
     <w:p>
@@ -2046,7 +2046,7 @@
           <w:i/>
           <w:u w:val="none"/>
         </w:rPr>
-        <w:t>Numbered 01 to 04 down the right, against a solid colour panel carrying the slide title, matching HMIS Essentials. Reveal one at a time if the build allows it.</w:t>
+        <w:t>Presented as a numbered list, as HMIS Essentials does. Visual treatment is not decided at this stage and is deliberately not described here.</w:t>
       </w:r>
     </w:p>
     <w:p>
@@ -2059,7 +2059,7 @@
           <w:i/>
           <w:u w:val="none"/>
         </w:rPr>
-        <w:t>These are written to sit under objective 02 of HMIS Essentials — search and find a participant's HMIS record to learn their back story — rather than restating it. The earlier draft of this slide had two of its three objectives sitting under Essentials objective 01 instead, which is what had this lesson teaching an introduction it does not own.</w:t>
+        <w:t>Written to sit under objective 02 of HMIS Essentials — search and find a participant's HMIS record to learn their back story — rather than restating it, and to leave room for the lessons that follow in HMIS Basic Navigation to take objectives 03 to 05 without overlapping this one. An earlier draft of this slide had two of its three objectives sitting under Essentials objective 01, which is what had this lesson teaching an introduction it does not own.</w:t>
       </w:r>
     </w:p>
     <w:p>
@@ -2249,7 +2249,7 @@
           <w:i/>
           <w:u w:val="none"/>
         </w:rPr>
-        <w:t>Reviewer-facing as much as learner-facing. If this list is on screen at all it should be as a series map with the current lesson marked, not read aloud in full.</w:t>
+        <w:t>Reviewer-facing as much as learner-facing — it is here so the boundary between this lesson and the rest of HMIS Basic Navigation is explicit and can be argued with. If it appears on screen at all, the current lesson is marked and the list is not read aloud in full. How it looks is a later question.</w:t>
       </w:r>
     </w:p>
     <w:p>

</xml_diff>